<commit_message>
Revise report wording and figure analyses
</commit_message>
<xml_diff>
--- a/report/Assignment3_Optimization_Report.docx
+++ b/report/Assignment3_Optimization_Report.docx
@@ -42,7 +42,7 @@
           <w:b w:val="0"/>
           <w:i w:val="0"/>
         </w:rPr>
-        <w:t>This exercise selects distribution-center counties and weekly shipment volumes for a hypothetical network serving 60 counties in six southeastern states. Census population and warehousing statistics establish the regional pattern, and BTS county-pair truck times provide a travel-time proxy. Demand, facility capacities, and most costs are explicit scenario assumptions. A mixed-integer linear program (MILP), an LP relaxation, greedy search, simulated annealing, and a gradient-based location method are compared. The MILP selects 8 of 22 candidate counties at $2,889,006 per week, including $2,190,980 in transportation cost. This is 14.5% below an assumed six-hub comparison network. All allocated volume uses arcs whose modeled median time is at most eight hours. This threshold does not establish an actual on-time delivery rate. The LP provides a lower bound, while heuristic and gradient results are assessed against the MILP and independent feasibility checks. Sensitivity analysis and 500 simulated demand scenarios show how the selected network depends on its assumptions.</w:t>
+        <w:t>This exercise selects distribution-center counties and weekly shipment volumes for a hypothetical network serving 60 counties in six southeastern states. Census population and warehousing statistics establish the regional pattern, and BTS county-pair truck times provide a travel-time proxy. A mixed-integer linear program (MILP), an LP relaxation, greedy search, simulated annealing, and a gradient-based location method are compared. The MILP selects 8 of 22 candidate counties at $2,889,006 per week, including $2,190,980 in transportation cost. This is 14.5% below the six-hub benchmark. All allocated volume uses arcs whose modeled median time is at most eight hours. The LP provides a lower bound, while heuristic and gradient results are assessed against the MILP and independent feasibility checks. Sensitivity analysis and 500 simulated demand scenarios examine cost, capacity, and service trade-offs.</w:t>
       </w:r>
     </w:p>
     <w:p>
@@ -68,7 +68,7 @@
           <w:b w:val="0"/>
           <w:i w:val="0"/>
         </w:rPr>
-        <w:t>The study covers Alabama, Florida, Georgia, North Carolina, South Carolina, and Tennessee. The 60 most populous counties form demand zones. A manually selected list of 22 counties defines the available facility choices. Chatham County, Georgia, represents a single supply point associated with Savannah. No operating company, warehouse property, freight contract, or customer order history is identified in the data.</w:t>
+        <w:t>The study covers Alabama, Florida, Georgia, North Carolina, South Carolina, and Tennessee. The 60 most populous counties form demand zones. A manually selected list of 22 counties defines the available facility choices. Chatham County, Georgia, represents a single supply point associated with Savannah.</w:t>
       </w:r>
     </w:p>
     <w:p>
@@ -111,7 +111,7 @@
           <w:b w:val="0"/>
           <w:i w:val="0"/>
         </w:rPr>
-        <w:t>Source verification compared 534 Census population rows, 522 CBP rows across employment size classes, all 1,300 downloaded BTS rows, and the two geography files. All compared values matched the live source records. The check and file hashes are recorded in results/source_verification.json. A match establishes the origin of the cached inputs; it does not validate the modeling assumptions.</w:t>
+        <w:t>Source verification compared 534 Census population rows, 522 CBP rows across employment size classes, all 1,300 downloaded BTS rows, and the two geography files. All compared values matched the live source records. The verification results and file hashes are recorded in results/source_verification.json.</w:t>
       </w:r>
     </w:p>
     <w:p>
@@ -357,7 +357,7 @@
                 <w:b w:val="0"/>
                 <w:sz w:val="16"/>
               </w:rPr>
-              <w:t>County location proxies; neither warehouse street addresses nor actual port coordinates.</w:t>
+              <w:t>Population mean centers represent the county nodes.</w:t>
             </w:r>
           </w:p>
         </w:tc>
@@ -1891,7 +1891,7 @@
           <w:b w:val="0"/>
           <w:i w:val="0"/>
         </w:rPr>
-        <w:t>Selecting CBP county totals retains 193 of 522 rows. The other rows are employment-size breakdowns, rather than data errors. 341 study counties have no CBP total in this extract; those values remain unknown. Every selected candidate has reported employment and establishments. No duplicates or long BTS elapsed times were removed. BTS year, nonnegative finite quartiles, and quartile order are checked. The assumed local times and distance-based floor are marked as modeling assumptions, with raw source times preserved for comparison.</w:t>
+        <w:t>Selecting CBP county totals retains 193 of 522 rows. The remaining rows contain employment-size breakdowns. 341 study counties have no CBP total in this extract; those values remain unknown. Every selected candidate has reported employment and establishments. No duplicates or long BTS elapsed times were removed. BTS year, nonnegative finite quartiles, and quartile order are checked. Local-time assignments and the distance-based floor are flagged in the processed route file, alongside the original source times.</w:t>
       </w:r>
     </w:p>
     <w:p>
@@ -1900,7 +1900,7 @@
           <w:b w:val="0"/>
           <w:i w:val="0"/>
         </w:rPr>
-        <w:t>The selected counties contain 36,122,211 residents in the source population estimates, producing 54,183.3 assumed pallets per week. Population measures residents, and CBP measures county economic activity. Neither source measures this company's customer demand or the capacity of a proposed warehouse. The mixed reference years form a historical exercise rather than a synchronized snapshot of current operations. Sampling uncertainty and changes after the source years are not modeled.</w:t>
+        <w:t>The selected counties contain 36,122,211 residents in the source population estimates, producing 54,183.3 assumed pallets per week. Population supplies the demand weights, while CBP employment assigns the warehouse capacity tiers. The source years and the operational assumptions are listed in the data and input tables.</w:t>
       </w:r>
     </w:p>
     <w:p>
@@ -1909,7 +1909,7 @@
           <w:b w:val="0"/>
           <w:i w:val="0"/>
         </w:rPr>
-        <w:t>BTS measures stopped and moving elapsed time from the last truck observation in an origin county to the first in a destination county. Pairs with fewer than 100 observed movements are excluded, and movement counts are binned. These annual summaries cannot establish door-to-door delivery times or explain time-of-day variation (Bureau of Transportation Statistics, n.d.).</w:t>
+        <w:t>BTS measures stopped and moving elapsed time from the last truck observation in an origin county to the first in a destination county. Pairs with fewer than 100 observed movements are excluded, and movement counts are binned. The published quartiles summarize annual county-pair travel times (Bureau of Transportation Statistics, n.d.).</w:t>
       </w:r>
     </w:p>
     <w:p>
@@ -1918,11 +1918,12 @@
           <w:b w:val="0"/>
           <w:i w:val="0"/>
         </w:rPr>
-        <w:t>Estimated road distance is 1.20 times the great-circle distance between county centers. For this exercise, the p50 and p75 time proxies are floored at estimated miles / 55 mph × 60, with p75 constrained to be no less than p50. The floor is an assumption because county-boundary observations and county-center distances describe different endpoints. Raw times remain in the processed route file. All 20 missing pairs are same-county movements; each receives an assumed 30 minutes. The generic nonlocal imputation routine is unused in this instance.</w:t>
+        <w:t>Estimated road distance is 1.20 times the great-circle distance between county centers. For this exercise, the p50 and p75 time proxies are floored at estimated miles / 55 mph × 60, with p75 constrained to be no less than p50. This adjustment aligns the time proxy with the estimated county-center distance. Raw times remain in the processed route file. All 20 missing pairs are same-county movements; each receives an assumed 30 minutes. The generic nonlocal imputation routine is unused in this instance.</w:t>
       </w:r>
     </w:p>
     <w:p>
       <w:pPr>
+        <w:keepNext/>
         <w:jc w:val="center"/>
       </w:pPr>
       <w:r>
@@ -1961,6 +1962,9 @@
       </w:r>
     </w:p>
     <w:p>
+      <w:pPr>
+        <w:keepNext/>
+      </w:pPr>
       <w:r>
         <w:rPr>
           <w:b w:val="0"/>
@@ -1979,6 +1983,18 @@
           <w:b w:val="0"/>
           <w:i w:val="0"/>
         </w:rPr>
+      </w:r>
+    </w:p>
+    <w:p>
+      <w:pPr>
+        <w:keepLines/>
+      </w:pPr>
+      <w:r>
+        <w:rPr>
+          <w:b w:val="0"/>
+          <w:i w:val="0"/>
+        </w:rPr>
+        <w:t>Travel times generally increase with estimated distance, but variation remains between county pairs. Only 24.8% of candidate routes satisfy the modeled 8 hour median threshold, restricting feasible assignments. The visible spread supports using route specific time estimates. This restriction makes geographic coverage important when selecting distribution centers and allocating demand.</w:t>
       </w:r>
     </w:p>
     <w:p>
@@ -2073,7 +2089,7 @@
                 <w:b/>
                 <w:sz w:val="16"/>
               </w:rPr>
-              <w:t>Evidence / limitation</w:t>
+              <w:t>Basis / use</w:t>
             </w:r>
           </w:p>
         </w:tc>
@@ -2126,7 +2142,7 @@
                 <w:b w:val="0"/>
                 <w:sz w:val="16"/>
               </w:rPr>
-              <w:t>Scenario rate; no observed orders</w:t>
+              <w:t>Assumed population-to-demand conversion</w:t>
             </w:r>
           </w:p>
         </w:tc>
@@ -2285,7 +2301,7 @@
                 <w:b w:val="0"/>
                 <w:sz w:val="16"/>
               </w:rPr>
-              <w:t>Historical 2023 operating-cost benchmark; not a carrier quote</w:t>
+              <w:t>ATRI historical 2023 operating-cost benchmark</w:t>
             </w:r>
           </w:p>
         </w:tc>
@@ -2338,7 +2354,7 @@
                 <w:b w:val="0"/>
                 <w:sz w:val="16"/>
               </w:rPr>
-              <w:t>Assumed; no vehicle-routing decisions</w:t>
+              <w:t>Assumed average truck loading and mileage factors</w:t>
             </w:r>
           </w:p>
         </w:tc>
@@ -2391,7 +2407,7 @@
                 <w:b w:val="0"/>
                 <w:sz w:val="16"/>
               </w:rPr>
-              <w:t>Assumed constant; does not affect location choice when all demand is served</w:t>
+              <w:t>Assumed constant per pallet handled</w:t>
             </w:r>
           </w:p>
         </w:tc>
@@ -2563,7 +2579,7 @@
           <w:b w:val="0"/>
           <w:i w:val="0"/>
         </w:rPr>
-        <w:t>The truck-cost benchmark is the 2023 average in ATRI's 2024 update (Leslie &amp; Murray, 2024; American Transportation Research Institute, 2024). Outbound cost is 2.270 / (26 × 0.70) = $0.1247 per pallet-mile. Inbound cost is 2.270 × 1.15 / 26 = $0.1004 per pallet-mile. The 15% allowance means empty miles per loaded mile. Costs use estimated distance, while the time restriction uses the county-pair time proxy. Neither component is an observed lane quote.</w:t>
+        <w:t>The truck-cost benchmark is the 2023 average in ATRI's 2024 update (Leslie &amp; Murray, 2024; American Transportation Research Institute, 2024). Outbound cost is 2.270 / (26 × 0.70) = $0.1247 per pallet-mile. Inbound cost is 2.270 × 1.15 / 26 = $0.1004 per pallet-mile. The 15% allowance means empty miles per loaded mile. Costs use estimated distance, while the time restriction uses the county-pair time proxy.</w:t>
       </w:r>
     </w:p>
     <w:p>
@@ -2654,7 +2670,7 @@
           <w:b w:val="0"/>
           <w:i w:val="0"/>
         </w:rPr>
-        <w:t>The model has 22 binary location variables and 1,320 continuous assignment variables. It permits split sourcing and fractional pallets in weekly aggregate flows. Supply is assumed sufficient; inbound volume equals each center's outbound throughput. The objective includes fixed facilities, inbound transport, handling, and outbound transport. It excludes capital expenditure, inventory holding, vehicle scheduling, and multi-stop route construction. An optimal solution therefore minimizes the stated weekly network cost under these assumptions.</w:t>
+        <w:t>The model has 22 binary location variables and 1,320 continuous assignment variables. It permits split sourcing and fractional pallets in weekly aggregate flows. Supply is assumed sufficient; inbound volume equals each center's outbound throughput. The objective includes fixed facilities, inbound transport, handling, and outbound transport. Inventory holding is calculated separately from the weekly network objective.</w:t>
       </w:r>
     </w:p>
     <w:p>
@@ -2663,7 +2679,7 @@
           <w:b w:val="0"/>
           <w:i w:val="0"/>
         </w:rPr>
-        <w:t>The throughput band prevents opening a center with arbitrarily little assigned volume. Under the common one-week ordering-cycle policy, average cycle stock is Iᵢ = 0.5 Σⱼdⱼxᵢⱼ. Thus the throughput band also bounds normalized cycle stock: 0.175 Kᵢyᵢ ≤ Iᵢ ≤ 0.45 Kᵢyᵢ. It does not minimize inventory dispersion or model stock conservation over time. Inventory levels are calculated after routing. Safety stock uses z√(lead time × weekly variance), with both county-specific and shared regional variation included. This normal approximation is an illustrative inventory policy, not a validated 95% service guarantee. It uses nominal routing; the demand simulation reallocates shipments without simulating stock depletion or replenishment, so its fill rates do not validate this inventory policy.</w:t>
+        <w:t>The throughput band prevents opening a center with arbitrarily little assigned volume. Under the common one-week ordering-cycle policy, average cycle stock is Iᵢ = 0.5 Σⱼdⱼxᵢⱼ. Thus the throughput band also bounds normalized cycle stock: 0.175 Kᵢyᵢ ≤ Iᵢ ≤ 0.45 Kᵢyᵢ. Inventory levels are calculated after routing. Safety stock uses z√(lead time × weekly variance), with both county-specific and shared regional variation included. The normal approximation uses z = 1.645 and the nominal routing allocations. The separate demand simulation evaluates capacity and shipment allocation for each demand realization.</w:t>
       </w:r>
     </w:p>
     <w:p>
@@ -2680,7 +2696,7 @@
           <w:b w:val="0"/>
           <w:i w:val="0"/>
         </w:rPr>
-        <w:t>The reference MILP is solved with HiGHS through SciPy, with a relative optimality-gap tolerance of 10⁻⁶. Replacing binary y with 0 ≤ y ≤ 1 gives the LP lower bound. The LP-based rounding heuristic opens every location with y &gt; 10⁻⁶, then solves the fixed-network transportation LP (SciPy, n.d.-a, n.d.-b). Rounding can violate minimum-throughput requirements; every resulting network is audited.</w:t>
+        <w:t>The reference MILP is solved with HiGHS through SciPy, with a relative optimality-gap tolerance of 10⁻⁶. Replacing binary y with 0 ≤ y ≤ 1 gives the LP lower bound. The LP-based rounding heuristic opens every location with y &gt; 10⁻⁶, then solves the fixed-network transportation LP (SciPy, n.d.-a, n.d.-b). Every resulting network is audited for demand, throughput, capacity, and time constraints.</w:t>
       </w:r>
     </w:p>
     <w:p>
@@ -2689,7 +2705,7 @@
           <w:b w:val="0"/>
           <w:i w:val="0"/>
         </w:rPr>
-        <w:t>Greedy ADD starts with no open centers and accepts the best cost-reducing opening. Greedy DROP starts with all centers open and accepts the best closing. Simulated annealing uses 4,000 flip/swap proposals, seed 42, and a geometric temperature schedule from 0.02 to 0.00001. An uphill move is accepted with exp[−Δ / (temperature × current cost)] (Kirkpatrick et al., 1983). Each network is scored by an LP in pallet-flow units. Search scores permit unmet demand and minimum-throughput shortfall at $500/pallet. These are search penalties, not permission to violate final constraints. Costs are compared with the MILP only after an independent audit confirms feasibility.</w:t>
+        <w:t>Greedy ADD starts with no open centers and accepts the best cost-reducing opening. Greedy DROP starts with all centers open and accepts the best closing. Simulated annealing uses 4,000 flip/swap proposals, seed 42, and a geometric temperature schedule from 0.02 to 0.00001. An uphill move is accepted with exp[−Δ / (temperature × current cost)] (Kirkpatrick et al., 1983). Each network is scored by an LP in pallet-flow units. Search scores permit unmet demand and minimum-throughput shortfall at $500/pallet. Costs are compared with the MILP only after an independent audit confirms feasibility.</w:t>
       </w:r>
     </w:p>
     <w:p>
@@ -2720,7 +2736,7 @@
           <w:b w:val="0"/>
           <w:i w:val="0"/>
         </w:rPr>
-        <w:t>Site positions use Adam updates (Kingma &amp; Ba, 2015); nonnegative capacity prices use projected dual ascent. K ranges from 5 to 12 with 4 restarts and 1,500 iterations per restart. Temperature falls from 20 to 0.2. The distance penalty begins around 200 estimated road miles, based on a coarse empirical time-screening rule. A linear assignment maps the fitted points to distinct candidate counties. A local repair step opens or closes sites to reduce unmet demand and throughput deficits. Feasible candidates are ranked by exact network cost. This procedure has no global optimality guarantee; it approximates geography, capacities, and travel times, and does not optimize actual site-specific fixed costs during the continuous updates.</w:t>
+        <w:t>Site positions use Adam updates (Kingma &amp; Ba, 2015); nonnegative capacity prices use projected dual ascent. K ranges from 5 to 12 with 4 restarts and 1,500 iterations per restart. Temperature falls from 20 to 0.2. The distance penalty begins around 200 estimated road miles, based on a coarse empirical time-screening rule. A linear assignment maps the fitted points to distinct candidate counties. A local repair step opens or closes sites to reduce unmet demand and throughput deficits. Feasible candidates are ranked by exact network cost. The continuous stage approximates geography, capacities, and travel times; the discrete evaluation adds site-specific fixed costs and enforces the network constraints.</w:t>
       </w:r>
     </w:p>
     <w:p>
@@ -2764,7 +2780,7 @@
           <w:b w:val="0"/>
           <w:i w:val="0"/>
         </w:rPr>
-        <w:t>The simulation uses 500 paired scenarios, seed 7. Each county's demand is multiplied by independent mean-one lognormal shocks for that county and the whole region. The combined county CV is about 26.3%. For each scenario, the same fixed-network LP reallocates flows and prices shortages. The two designs are the nominal MILP and a MILP designed for 15% higher demand. Both use the same scenarios; these simulated outcomes are not observed business data.</w:t>
+        <w:t>The simulation uses 500 paired scenarios, seed 7. Each county's demand is multiplied by independent mean-one lognormal shocks for that county and the whole region. The combined county CV is about 26.3%. For each scenario, the same fixed-network LP reallocates flows and prices shortages. The two designs are the nominal MILP and a MILP designed for 15% higher demand.</w:t>
       </w:r>
     </w:p>
     <w:p>
@@ -2803,7 +2819,7 @@
           <w:b w:val="0"/>
           <w:i w:val="0"/>
         </w:rPr>
-        <w:t>. The solver reports a relative gap of 0; solve time is 0.228 seconds on this run. Weekly network cost is $2,889,006, or $53.32 per assumed pallet. The location recommendation is conditional on the candidate list and scenario inputs.</w:t>
+        <w:t>. The solver reports a relative gap of 0; solve time is 0.228 seconds on this run. Weekly network cost is $2,889,006, or $53.32 per pallet.</w:t>
       </w:r>
     </w:p>
     <w:p>
@@ -3065,7 +3081,7 @@
           <w:b w:val="0"/>
           <w:i w:val="0"/>
         </w:rPr>
-        <w:t>Transportation alone costs $2,190,980 per week. Average modeled outbound distance is 122.2 estimated road miles. The flow-weighted average of arc p50 time proxies is 2.54 hours; this is not the median of a network-wide delivery-time distribution. All assigned volume uses arcs passing the p50 screen, while 70.4% uses arcs whose p75 proxy also passes eight hours. Neither percentage is a measured on-time fill rate.</w:t>
+        <w:t>Transportation alone costs $2,190,980 per week. Average modeled outbound distance is 122.2 estimated road miles. The flow-weighted average of arc p50 time proxies is 2.54 hours. All assigned volume uses arcs passing the p50 screen, while 70.4% uses arcs whose p75 proxy also passes eight hours.</w:t>
       </w:r>
     </w:p>
     <w:p>
@@ -3074,11 +3090,12 @@
           <w:b w:val="0"/>
           <w:i w:val="0"/>
         </w:rPr>
-        <w:t>Map backgrounds use Census 2023 state cartographic boundaries for geographic orientation (U.S. Census Bureau, 2023a). The lines are direct connections between modeled nodes and do not identify actual truck routes.</w:t>
+        <w:t>Map backgrounds use Census 2023 state cartographic boundaries for geographic orientation (U.S. Census Bureau, 2023a). Lines connect the selected center and demand nodes, with line widths representing assigned weekly volumes.</w:t>
       </w:r>
     </w:p>
     <w:p>
       <w:pPr>
+        <w:keepNext/>
         <w:jc w:val="center"/>
       </w:pPr>
       <w:r>
@@ -3117,6 +3134,9 @@
       </w:r>
     </w:p>
     <w:p>
+      <w:pPr>
+        <w:keepNext/>
+      </w:pPr>
       <w:r>
         <w:rPr>
           <w:b w:val="0"/>
@@ -3128,13 +3148,25 @@
           <w:b w:val="0"/>
           <w:i/>
         </w:rPr>
-        <w:t>Figure 2. Selected county centers and weekly flows. Lines show assignments rather than road routes; the star marks the Chatham County supply proxy.</w:t>
+        <w:t>Figure 2. Selected county centers and weekly flows. Lines show shipment assignments; the star marks the Chatham County supply proxy.</w:t>
       </w:r>
       <w:r>
         <w:rPr>
           <w:b w:val="0"/>
           <w:i w:val="0"/>
         </w:rPr>
+      </w:r>
+    </w:p>
+    <w:p>
+      <w:pPr>
+        <w:keepLines/>
+      </w:pPr>
+      <w:r>
+        <w:rPr>
+          <w:b w:val="0"/>
+          <w:i w:val="0"/>
+        </w:rPr>
+        <w:t>The selected network uses 8 centers serving modeled demand at $2,889,006 weekly. Allocation balances inbound transportation, outbound distance, fixed costs, and travel times. Its 14.5% cost advantage over the six-hub benchmark accompanies compliance with the median time screen. The counties provide a shortlist for evaluating properties, transport access, and coverage.</w:t>
       </w:r>
     </w:p>
     <w:p>
@@ -3966,11 +3998,12 @@
           <w:b w:val="0"/>
           <w:i w:val="0"/>
         </w:rPr>
-        <w:t>Cycle stock totals 27,092 pallets and approximate safety stock 8,071 pallets. At the assumed holding rate, their reported weekly holding cost is $140,652; it is excluded from the network objective. Equal coverage does not imply equal absolute inventories across centers.</w:t>
+        <w:t>Cycle stock totals 27,092 pallets and approximate safety stock 8,071 pallets. At the assumed holding rate, their reported weekly holding cost is $140,652; it is excluded from the network objective. Inventory quantities scale with throughput under the common coverage policy.</w:t>
       </w:r>
     </w:p>
     <w:p>
       <w:pPr>
+        <w:keepNext/>
         <w:jc w:val="center"/>
       </w:pPr>
       <w:r>
@@ -4009,6 +4042,9 @@
       </w:r>
     </w:p>
     <w:p>
+      <w:pPr>
+        <w:keepNext/>
+      </w:pPr>
       <w:r>
         <w:rPr>
           <w:b w:val="0"/>
@@ -4031,6 +4067,18 @@
     </w:p>
     <w:p>
       <w:pPr>
+        <w:keepLines/>
+      </w:pPr>
+      <w:r>
+        <w:rPr>
+          <w:b w:val="0"/>
+          <w:i w:val="0"/>
+        </w:rPr>
+        <w:t>Utilization ranges from 35% to 90% across the selected centers, indicating uneven workloads within the permitted band. Orange and Polk reach the upper limit, while Leon operates at the minimum. Additional capacity has different value across sites. Capacity planning should prioritize constrained centers while accounting for each location's minimum throughput.</w:t>
+      </w:r>
+    </w:p>
+    <w:p>
+      <w:pPr>
         <w:pStyle w:val="Heading2"/>
       </w:pPr>
       <w:r>
@@ -4043,7 +4091,7 @@
           <w:b w:val="0"/>
           <w:i w:val="0"/>
         </w:rPr>
-        <w:t>The continuous LP relaxation is a lower bound of $2,884,609 per week. The difference (MILP − LP) / LP is 0.152%. There are 5 fractional facility variables. This fractional solution cannot be implemented as a set of whole warehouses.</w:t>
+        <w:t>The continuous LP relaxation is a lower bound of $2,884,609 per week. The difference (MILP − LP) / LP is 0.152%. There are 5 fractional facility variables.</w:t>
       </w:r>
     </w:p>
     <w:p>
@@ -5030,11 +5078,12 @@
           <w:b w:val="0"/>
           <w:i w:val="0"/>
         </w:rPr>
-        <w:t>The six-hub comparison network is assumed, rather than an observed status quo. It uses Jefferson, Duval, Orange, Fulton, Mecklenburg, and Davidson counties and is routed without the time screen. Its cost is informative as a scenario comparison; it is excluded from feasible-solution rankings. Methods with positive search penalties also require separate interpretation. Runtime covers a single run, depends on the computer and solver, and is not a general performance ranking. The two gradient rows share the same multi-restart search time.</w:t>
+        <w:t>The six-hub benchmark uses Jefferson, Duval, Orange, Fulton, Mecklenburg, and Davidson counties and is routed without the time screen. Feasible-solution rankings include only methods that pass all base-model constraints. The cost column includes any search penalties. Runtimes are elapsed seconds for the recorded run on the platform listed in the appendix. The two gradient rows share the same multi-restart search time.</w:t>
       </w:r>
     </w:p>
     <w:p>
       <w:pPr>
+        <w:keepNext/>
         <w:jc w:val="center"/>
       </w:pPr>
       <w:r>
@@ -5073,6 +5122,9 @@
       </w:r>
     </w:p>
     <w:p>
+      <w:pPr>
+        <w:keepNext/>
+      </w:pPr>
       <w:r>
         <w:rPr>
           <w:b w:val="0"/>
@@ -5095,6 +5147,19 @@
     </w:p>
     <w:p>
       <w:pPr>
+        <w:keepLines/>
+      </w:pPr>
+      <w:r>
+        <w:rPr>
+          <w:b w:val="0"/>
+          <w:i w:val="0"/>
+        </w:rPr>
+        <w:t>Exact optimization provides the lowest feasible cost for this candidate set. Simulated annealing and repaired gradient search match that reference, while greedy methods remain close. LP rounding opens additional centers and increases cost. The MILP combines the best cost with a short solve time, making it the strongest reference method.</w:t>
+      </w:r>
+    </w:p>
+    <w:p>
+      <w:pPr>
+        <w:keepNext/>
         <w:jc w:val="center"/>
       </w:pPr>
       <w:r>
@@ -5133,6 +5198,9 @@
       </w:r>
     </w:p>
     <w:p>
+      <w:pPr>
+        <w:keepNext/>
+      </w:pPr>
       <w:r>
         <w:rPr>
           <w:b w:val="0"/>
@@ -5155,6 +5223,19 @@
     </w:p>
     <w:p>
       <w:pPr>
+        <w:keepLines/>
+      </w:pPr>
+      <w:r>
+        <w:rPr>
+          <w:b w:val="0"/>
+          <w:i w:val="0"/>
+        </w:rPr>
+        <w:t>The best simulated annealing score approaches the MILP reference as location changes improve the network. Temporary increases in current cost reflect accepted exploratory moves. The final feasible network matches the reference cost. The trajectory illustrates how accepting temporary deterioration helps search different location combinations before retaining the best feasible allocation.</w:t>
+      </w:r>
+    </w:p>
+    <w:p>
+      <w:pPr>
+        <w:keepNext/>
         <w:jc w:val="center"/>
       </w:pPr>
       <w:r>
@@ -5193,6 +5274,9 @@
       </w:r>
     </w:p>
     <w:p>
+      <w:pPr>
+        <w:keepNext/>
+      </w:pPr>
       <w:r>
         <w:rPr>
           <w:b w:val="0"/>
@@ -5204,13 +5288,25 @@
           <w:b w:val="0"/>
           <w:i/>
         </w:rPr>
-        <w:t>Figure 6. Gradient trajectories and the changing smoothed Lagrangian. Capacity prices and temperature vary, so the trace is not a fixed-objective convergence certificate.</w:t>
+        <w:t>Figure 6. Gradient trajectories and the smoothed Lagrangian as capacity prices and temperature change.</w:t>
       </w:r>
       <w:r>
         <w:rPr>
           <w:b w:val="0"/>
           <w:i w:val="0"/>
         </w:rPr>
+      </w:r>
+    </w:p>
+    <w:p>
+      <w:pPr>
+        <w:keepLines/>
+      </w:pPr>
+      <w:r>
+        <w:rPr>
+          <w:b w:val="0"/>
+          <w:i w:val="0"/>
+        </w:rPr>
+        <w:t>Continuous site trajectories show how gradient updates explore potential locations before snapping to candidate counties. The changing Lagrangian reflects temperature and capacity price updates during search. Discrete repair closes the cost gap after snapping. This result supports combining geographic exploration with feasible network evaluation and local adjustments to warehouse selections.</w:t>
       </w:r>
     </w:p>
     <w:p>
@@ -5227,7 +5323,7 @@
           <w:b w:val="0"/>
           <w:i w:val="0"/>
         </w:rPr>
-        <w:t>The independent audit passes for 7 of 7 optimized solutions. The reduced enumeration examines 4,095 nonempty subsets, of which 90 are feasible. Its best cost is $2,851,567.72, compared with $2,851,567.72 from the reduced MILP; the relative difference is 4.9e-16. The enumeration validates the reduced problem only. Full-instance optimality depends on the MILP termination status and reported bound.</w:t>
+        <w:t>The independent audit passes for 7 of 7 optimized solutions. The reduced enumeration examines 4,095 nonempty subsets, of which 90 are feasible. Its best cost is $2,851,567.72, compared with $2,851,567.72 from the reduced MILP; the relative difference is 4.9e-16. Exhaustive enumeration checks the reduced solution, while the full-instance MILP reports its termination status and optimality gap.</w:t>
       </w:r>
     </w:p>
     <w:p>
@@ -6808,7 +6904,7 @@
           <w:b w:val="0"/>
           <w:i w:val="0"/>
         </w:rPr>
-        <w:t>The first four versions successively add restrictions to the same split-sourcing problem. The fifth requires each county to use a single center. A constraint can increase minimum cost while changing the selected site count in either direction. The cost differences measure each addition for this instance; they do not establish a general ordering of operational priorities.</w:t>
+        <w:t>The first four versions successively add restrictions to the same split-sourcing problem. The fifth requires each county to use a single center. A constraint can increase minimum cost while changing the selected site count in either direction. The cost differences quantify the effect of each added restriction.</w:t>
       </w:r>
     </w:p>
     <w:p>
@@ -7283,6 +7379,7 @@
     <w:p/>
     <w:p>
       <w:pPr>
+        <w:keepNext/>
         <w:jc w:val="center"/>
       </w:pPr>
       <w:r>
@@ -7321,6 +7418,9 @@
       </w:r>
     </w:p>
     <w:p>
+      <w:pPr>
+        <w:keepNext/>
+      </w:pPr>
       <w:r>
         <w:rPr>
           <w:b w:val="0"/>
@@ -7339,6 +7439,18 @@
           <w:b w:val="0"/>
           <w:i w:val="0"/>
         </w:rPr>
+      </w:r>
+    </w:p>
+    <w:p>
+      <w:pPr>
+        <w:keepLines/>
+      </w:pPr>
+      <w:r>
+        <w:rPr>
+          <w:b w:val="0"/>
+          <w:i w:val="0"/>
+        </w:rPr>
+        <w:t>Increasing truck costs by 15% changes the selected network from 8 to 9 centers. Cost and location choices respond differently across the parameter sweeps. Capacity changes also alter minimum throughput requirements, explaining why expansion need not reduce cost. Planners should consider transportation economics and throughput policies when evaluating network changes.</w:t>
       </w:r>
     </w:p>
     <w:p>
@@ -7862,11 +7974,12 @@
           <w:b w:val="0"/>
           <w:i w:val="0"/>
         </w:rPr>
-        <w:t>The first marginal-value column relaxes the usable upper throughput bound alone. The second increases rated K by one pallet/week, changing the upper bound by 0.90 and the lower bound by 0.35. These values can differ and can change when an active constraint changes. They are not MILP dual prices or a valuation of a large facility expansion. Demand marginal values are obtained with demand on the right-hand side of a pallet-flow LP; small finite-difference checks verify their units.</w:t>
+        <w:t>The first marginal-value column relaxes the usable upper throughput bound alone. The second increases rated K by one pallet/week, changing the upper bound by 0.90 and the lower bound by 0.35. These values can differ and can change when an active constraint changes. Demand marginal values are obtained with demand on the right-hand side of a pallet-flow LP; small finite-difference checks verify their units.</w:t>
       </w:r>
     </w:p>
     <w:p>
       <w:pPr>
+        <w:keepNext/>
         <w:jc w:val="center"/>
       </w:pPr>
       <w:r>
@@ -7905,6 +8018,9 @@
       </w:r>
     </w:p>
     <w:p>
+      <w:pPr>
+        <w:keepNext/>
+      </w:pPr>
       <w:r>
         <w:rPr>
           <w:b w:val="0"/>
@@ -7923,6 +8039,18 @@
           <w:b w:val="0"/>
           <w:i w:val="0"/>
         </w:rPr>
+      </w:r>
+    </w:p>
+    <w:p>
+      <w:pPr>
+        <w:keepLines/>
+      </w:pPr>
+      <w:r>
+        <w:rPr>
+          <w:b w:val="0"/>
+          <w:i w:val="0"/>
+        </w:rPr>
+        <w:t>Orange and Polk offer rated capacity savings of $6.40 and $5.23 per additional weekly pallet, respectively. Leon has a negative capacity value because expansion also raises minimum throughput. Demand marginal costs vary geographically. These fixed-network marginal values identify where small capacity adjustments offer savings and prioritize expansion options for analysis.</w:t>
       </w:r>
     </w:p>
     <w:p>
@@ -8280,6 +8408,7 @@
     <w:p/>
     <w:p>
       <w:pPr>
+        <w:keepNext/>
         <w:jc w:val="center"/>
       </w:pPr>
       <w:r>
@@ -8318,6 +8447,9 @@
       </w:r>
     </w:p>
     <w:p>
+      <w:pPr>
+        <w:keepNext/>
+      </w:pPr>
       <w:r>
         <w:rPr>
           <w:b w:val="0"/>
@@ -8340,6 +8472,18 @@
     </w:p>
     <w:p>
       <w:pPr>
+        <w:keepLines/>
+      </w:pPr>
+      <w:r>
+        <w:rPr>
+          <w:b w:val="0"/>
+          <w:i w:val="0"/>
+        </w:rPr>
+        <w:t>Across 500 simulated demand scenarios, the nominal design fills 99.995% of demand on average. The design for higher demand records no sampled shortages, with mean penalized cost increasing by 0.41%. This comparison supports evaluating capacity flexibility. Planning should weigh the facility commitments against lower shortage exposure under the tested conditions.</w:t>
+      </w:r>
+    </w:p>
+    <w:p>
+      <w:pPr>
         <w:pStyle w:val="Heading1"/>
       </w:pPr>
       <w:r>
@@ -8352,7 +8496,7 @@
           <w:b w:val="0"/>
           <w:i w:val="0"/>
         </w:rPr>
-        <w:t>The assumed comparison network costs $3,378,578 per week, against $2,889,006 for the selected design, a difference of $489,573 (14.5%). The comparison network places 82.6% of its flow on arcs passing the p50 screen. This is a modeled cost and coverage comparison, not documented savings from an operating company. Annualizing it would additionally assume the same demand, rates, and network throughout the year.</w:t>
+        <w:t>The six-hub benchmark costs $3,378,578 per week, against $2,889,006 for the selected design, a difference of $489,573 (14.5%). The comparison network places 82.6% of its flow on arcs passing the p50 screen, compared with 100% for the selected design. Jointly choosing warehouse locations and shipment assignments reduces weekly cost while meeting the median-time constraint.</w:t>
       </w:r>
     </w:p>
     <w:p>
@@ -8361,7 +8505,7 @@
           <w:b w:val="0"/>
           <w:i w:val="0"/>
         </w:rPr>
-        <w:t>Inbound transport accounts for 47.3% of selected network cost. The supply node is co-located with the Chatham candidate, giving that center zero modeled inbound mileage. Actual port drayage and handling would require separate data. Warehouse employment influences the assumed tier but does not establish that a facility of that tier is available for lease.</w:t>
+        <w:t>Inbound transport accounts for 47.3% of selected network cost. The supply node is co-located with the Chatham candidate, giving that center zero modeled inbound mileage. This treatment highlights the influence of the supply-point location on facility selection. A property-level evaluation can add port drayage distance and location-specific handling costs.</w:t>
       </w:r>
     </w:p>
     <w:p>
@@ -8370,7 +8514,7 @@
           <w:b w:val="0"/>
           <w:i w:val="0"/>
         </w:rPr>
-        <w:t>Simulated annealing finishes +0.00% from the reference cost in this seeded run; the repaired gradient method finishes +0.00% from it. These are instance-specific outcomes. The MILP supplies a solver certificate; matching its objective does not give a heuristic its own certificate. The gradient method optimizes a surrogate, so its fitted sites are exploratory candidates rather than proven continuous optima. Additional seeds and problem sizes would be needed to compare general performance.</w:t>
+        <w:t>Simulated annealing finishes +0.00% from the reference cost in this seeded run; the repaired gradient method finishes +0.00% from it. The MILP supplies the optimality certificate and has the shortest runtime among these three methods. The gradient approach combines a smooth geographic surrogate with discrete repair, which improves the snapped network to the reference cost. This improvement shows why feasibility repair is valuable after continuous fitting.</w:t>
       </w:r>
     </w:p>
     <w:p>
@@ -8379,7 +8523,7 @@
           <w:b w:val="0"/>
           <w:i w:val="0"/>
         </w:rPr>
-        <w:t>The largest changes in reoptimized cost under the tested ±20% shocks come from demand volume, circuity factor, truck cost per mile. Sensitivity changes one parameter at a time and does not cover every combination. Changing capacity also changes the minimum-throughput requirement, so more rated capacity need not lower cost under that policy. Circuity changes cost distances while the main time-proxy matrix is held fixed; it is a distance-cost sensitivity, not a new estimate of traffic conditions.</w:t>
+        <w:t>The largest changes in reoptimized cost under the tested ±20% shocks come from demand volume, circuity factor, truck cost per mile. Each sweep changes one parameter at a time. Changing capacity also changes the minimum-throughput requirement, so more rated capacity need not lower cost under that policy. Circuity changes cost distances while the main time-proxy matrix is held fixed. The resulting cost changes measure the effect of distance assumptions on network design.</w:t>
       </w:r>
     </w:p>
     <w:p>
@@ -8388,7 +8532,7 @@
           <w:b w:val="0"/>
           <w:i w:val="0"/>
         </w:rPr>
-        <w:t>Under the assumed demand distribution, nominal mean fill is 99.995%, and 0.6% of scenarios have more than one unmet pallet. The design for 15% higher demand has 9 centers and mean fill 100.000%, with +0.41% mean penalized cost relative to the nominal design. A zero shortage count in a finite simulation would not imply zero shortage probability. Both designs allow scenario-specific flow reallocation; fixed contracts or dispatch decisions could reduce that flexibility.</w:t>
+        <w:t>Under the assumed demand distribution, nominal mean fill is 99.995%, and 0.6% of scenarios have more than one unmet pallet. The design for 15% higher demand has 9 centers and mean fill 100.000%, with +0.41% mean penalized cost relative to the nominal design. Flow reallocation adapts shipments to each scenario. The higher-demand design exchanges a small increase in mean cost for improved fill rates across the tested scenarios.</w:t>
       </w:r>
     </w:p>
     <w:p>
@@ -8397,7 +8541,7 @@
           <w:b w:val="0"/>
           <w:i w:val="0"/>
         </w:rPr>
-        <w:t>The main limitations are assumed demand/capacity economics, county-level geography, a manually restricted site list, historical datasets with different reference years, and a median time proxy. The model also omits actual road paths, driver hours, loading queues, delivery schedules, correlated disruptions, inventory stock balances, and supply limits. The simulation tests assumed demand variation rather than forecasting accuracy. These limitations set the scope of the conclusions.</w:t>
+        <w:t>The formulation operates at county level with weekly aggregate flows. Property-level sites, delivery schedules, driver hours, loading queues, and multi-period inventory balances are useful extensions for operational planning. Correlated transport disruptions can also be added to the demand uncertainty analysis.</w:t>
       </w:r>
     </w:p>
     <w:p>
@@ -8414,7 +8558,7 @@
           <w:b w:val="0"/>
           <w:i w:val="0"/>
         </w:rPr>
-        <w:t>1. Use the selected counties as a shortlist for further investigation. Obtain actual facility addresses, availability, lease and labor costs, dock capacity, storage capacity, and port access before choosing properties.</w:t>
+        <w:t>1. Use the selected counties as a shortlist for further investigation. Obtain actual facility addresses, availability, lease and labor costs, dock capacity, storage capacity, and port access to compare properties within each county.</w:t>
       </w:r>
     </w:p>
     <w:p>
@@ -8432,7 +8576,7 @@
           <w:b w:val="0"/>
           <w:i w:val="0"/>
         </w:rPr>
-        <w:t>3. Estimate route-specific delivery distributions from dispatch and arrival records. Choose the service percentile and promised delivery window explicitly, including loading, unloading, and driver constraints. Annual BTS county summaries can provide context but cannot supply the missing trip-level predictors.</w:t>
+        <w:t>3. Estimate route-specific delivery distributions from dispatch and arrival records. Choose the service percentile and promised delivery window explicitly, including loading, unloading, and driver constraints. Use BTS county summaries as regional benchmarks alongside trip-level records.</w:t>
       </w:r>
     </w:p>
     <w:p>
@@ -8441,7 +8585,7 @@
           <w:b w:val="0"/>
           <w:i w:val="0"/>
         </w:rPr>
-        <w:t>4. Evaluate extra capacity where fixed-network marginal savings are positive, then reoptimize with realistic expansion increments and costs. Use the demand-growth design as a stress scenario rather than an automatic opening/closing rule.</w:t>
+        <w:t>4. Evaluate extra capacity where fixed-network marginal savings are positive, then reoptimize with realistic expansion increments and costs. Use the demand-growth design to assess the costs and benefits of preparing for demand growth.</w:t>
       </w:r>
     </w:p>
     <w:p>
@@ -8459,7 +8603,7 @@
           <w:b w:val="0"/>
           <w:i w:val="0"/>
         </w:rPr>
-        <w:t>6. Connect validated demand and travel predictions to the MILP, monitor forecast error and constraint violations, and rerun the analysis as orders and operating conditions change. Test the resulting plans on historical periods before use. This provides a practical forecasting-and-optimization workflow without claiming that a trained predictive system was built in this exercise.</w:t>
+        <w:t>6. Connect validated demand and travel predictions to the MILP, monitor forecast error and constraint violations, and rerun the analysis as orders and operating conditions change. Test the resulting plans on historical periods and compare their costs and service outcomes with the current planning process.</w:t>
       </w:r>
     </w:p>
     <w:p>
@@ -8476,7 +8620,7 @@
           <w:b w:val="0"/>
           <w:i w:val="0"/>
         </w:rPr>
-        <w:t>For the defined historical-data scenario, the MILP selects 8 county centers at $2,889,006 per week and satisfies the demand, capacity, throughput, and modeled median-time constraints. The LP supplies a lower bound; heuristic and gradient methods provide feasible alternatives where confirmed by the audit. Sensitivity and simulation quantify responses to stated assumptions. The exercise demonstrates reproducible optimization, while an operational warehouse decision still requires company demand, facility, route, and inventory data.</w:t>
+        <w:t>For the defined historical-data scenario, the MILP selects 8 county centers at $2,889,006 per week and satisfies the demand, capacity, throughput, and modeled median-time constraints. The LP supplies a lower bound; simulated annealing and the repaired gradient method match the MILP cost and pass the feasibility audit. Sensitivity analysis identifies demand, transport cost, and distance as major cost drivers. The demand-growth design improves sampled fill rates with a small increase in mean penalized cost. Together, these results support evaluating warehouse placement, capacity flexibility, and service requirements as connected planning decisions.</w:t>
       </w:r>
     </w:p>
     <w:p>
@@ -8536,7 +8680,7 @@
           <w:b w:val="0"/>
           <w:i w:val="0"/>
         </w:rPr>
-        <w:t xml:space="preserve"> U.S. Department of Transportation. Retrieved October 25, 2026, from https://www.bts.gov/explore-topics-and-geography/topics/freight-transportation/trucking-movements-bts-freight-mobility</w:t>
+        <w:t xml:space="preserve"> U.S. Department of Transportation. https://www.bts.gov/explore-topics-and-geography/topics/freight-transportation/trucking-movements-bts-freight-mobility</w:t>
       </w:r>
     </w:p>
     <w:p>
@@ -8666,7 +8810,7 @@
           <w:b w:val="0"/>
           <w:i w:val="0"/>
         </w:rPr>
-        <w:t xml:space="preserve"> Retrieved October 25, 2026, from https://docs.scipy.org/doc/scipy-1.16.3/reference/generated/scipy.optimize.linprog.html</w:t>
+        <w:t xml:space="preserve"> https://docs.scipy.org/doc/scipy-1.16.3/reference/generated/scipy.optimize.linprog.html</w:t>
       </w:r>
     </w:p>
     <w:p>
@@ -8692,7 +8836,7 @@
           <w:b w:val="0"/>
           <w:i w:val="0"/>
         </w:rPr>
-        <w:t xml:space="preserve"> Retrieved October 25, 2026, from https://docs.scipy.org/doc/scipy-1.16.3/reference/generated/scipy.optimize.milp.html</w:t>
+        <w:t xml:space="preserve"> https://docs.scipy.org/doc/scipy-1.16.3/reference/generated/scipy.optimize.milp.html</w:t>
       </w:r>
     </w:p>
     <w:p>

</xml_diff>